<commit_message>
Catch up with October GitHub work; Time Flow is now closed source
time-flow-web (the public PWA) was removed and Time Flow continues in a
private repo as an Android app being built for commercial release, so
every time-flow-web link was dead.

- Source/Time_Flow: rewritten for the Android app (v0.4.0, CI, signed
  releases); scheduler code and data model removed since this repo is
  public
- Source/MGM_Prayer_Alerts: v1.1.0 redesign, GitHub Actions releases,
  v1.1.1 Awqat bot-check fallback
- Source/GitHub_Overview: re-audit of 21 Oct, including private repos
- base_resume: Time Flow as closed source with demo on request; MGM
  gains the outage-fix bullet; base PDF/DOCX re-rendered (2 pages)
- pay.com.au (Ready, unsent): dead links replaced and re-rendered
- Submitted applications left as sent; noted in the tracker

Co-Authored-By: Claude Opus 5.5 <noreply@anthropic.com>
Claude-Session: https://claude.ai/code/session_018K48sPd6fZ6f4RxmdVC7MK
</commit_message>
<xml_diff>
--- a/Faraaz_Mohammed_Resume_Base.docx
+++ b/Faraaz_Mohammed_Resume_Base.docx
@@ -37,7 +37,7 @@
         <w:spacing w:after="20"/>
         <w:jc w:val="center"/>
       </w:pPr>
-      <w:hyperlink w:history="1" r:id="rId5kmolvlslwmaozvvb-ybd">
+      <w:hyperlink w:history="1" r:id="rIdtni-anofzlzifxwdxuyhw">
         <w:r>
           <w:rPr>
             <w:color w:val="1F3A5F"/>
@@ -56,7 +56,7 @@
         </w:rPr>
         <w:t xml:space="preserve">  •  </w:t>
       </w:r>
-      <w:hyperlink w:history="1" r:id="rIdnuamr1hfxmwokcrorfkas">
+      <w:hyperlink w:history="1" r:id="rId9gx5y2h7rvoe6jn5sdghn">
         <w:r>
           <w:rPr>
             <w:color w:val="1F3A5F"/>
@@ -75,7 +75,7 @@
         </w:rPr>
         <w:t xml:space="preserve">  •  </w:t>
       </w:r>
-      <w:hyperlink w:history="1" r:id="rIdo3h7ipgcpdacmi4kttfti">
+      <w:hyperlink w:history="1" r:id="rIdit-znedzogu5sf_322k54">
         <w:r>
           <w:rPr>
             <w:color w:val="1F3A5F"/>
@@ -131,7 +131,7 @@
           <w:sz w:val="20"/>
           <w:szCs w:val="20"/>
         </w:rPr>
-        <w:t xml:space="preserve">Master of Artificial Intelligence graduate (RMIT, 2026) with a B.Tech in IT and an AI/ML engineering internship delivering geospatial ML pipelines at national scale. Co-author of a peer-reviewed computer-vision paper. Works end to end — requirements, code, tests, review — across Python ML, Android (Kotlin) and web; shipped an Android app, an offline-first PWA and an MCP-based LLM tool in 2026. Seeking a graduate AI/ML or software engineering role anywhere in Australia.</w:t>
+        <w:t xml:space="preserve">Master of Artificial Intelligence graduate (RMIT, 2026) with a B.Tech in IT and an AI/ML engineering internship delivering geospatial ML pipelines at national scale. Co-author of a peer-reviewed computer-vision paper. Works end to end — requirements, code, tests, review — across Python ML, Android (Kotlin) and web; built two Android apps (one in community use) and an MCP-based LLM tool in 2026. Seeking a graduate AI/ML or software engineering role anywhere in Australia.</w:t>
       </w:r>
     </w:p>
     <w:p>
@@ -619,7 +619,7 @@
           <w:sz w:val="19"/>
           <w:szCs w:val="19"/>
         </w:rPr>
-        <w:t xml:space="preserve">Melbourne, VIC  ·  Coursework: Intelligent Decision Making (ASP/Clingo), Computer Vision, Machine Learning, AI Systems Design</w:t>
+        <w:t xml:space="preserve">Melbourne, VIC  ·  Coursework: Intelligent Decision Making (ASP/Clingo), Computer Vision, Machine Learning, AI Systems Design, Internet of Things (IoT)</w:t>
       </w:r>
     </w:p>
     <w:p>
@@ -698,7 +698,7 @@
           <w:sz w:val="21"/>
           <w:szCs w:val="21"/>
         </w:rPr>
-        <w:t xml:space="preserve">Time Flow — ADHD-focused planner (PWA)</w:t>
+        <w:t xml:space="preserve">Time Flow — ADHD-focused planner (Android, closed source)</w:t>
       </w:r>
       <w:r>
         <w:rPr>
@@ -706,7 +706,7 @@
           <w:sz w:val="19"/>
           <w:szCs w:val="19"/>
         </w:rPr>
-        <w:t xml:space="preserve">  ·  JavaScript, Service Worker, Web Notifications, Kotlin bridge</w:t>
+        <w:t xml:space="preserve">  ·  JavaScript, Kotlin</w:t>
       </w:r>
       <w:r>
         <w:tab/>
@@ -719,58 +719,58 @@
           <w:sz w:val="20"/>
           <w:szCs w:val="20"/>
         </w:rPr>
-        <w:t xml:space="preserve">Jul – Sep 2026</w:t>
-      </w:r>
-    </w:p>
-    <w:p>
-      <w:pPr>
-        <w:pStyle w:val="ListParagraph"/>
-        <w:numPr>
-          <w:ilvl w:val="0"/>
-          <w:numId w:val="2"/>
-        </w:numPr>
-        <w:spacing w:after="24"/>
-      </w:pPr>
-      <w:r>
-        <w:rPr>
-          <w:sz w:val="20"/>
-          <w:szCs w:val="20"/>
-        </w:rPr>
-        <w:t xml:space="preserve">Built and deployed an installable, offline-first PWA (4,600 lines of vanilla JS, no framework or build step) that schedules goals, recurring targets and reminders into free minutes using an urgency × importance scoring model.</w:t>
-      </w:r>
-    </w:p>
-    <w:p>
-      <w:pPr>
-        <w:pStyle w:val="ListParagraph"/>
-        <w:numPr>
-          <w:ilvl w:val="0"/>
-          <w:numId w:val="2"/>
-        </w:numPr>
-        <w:spacing w:after="24"/>
-      </w:pPr>
-      <w:r>
-        <w:rPr>
-          <w:sz w:val="20"/>
-          <w:szCs w:val="20"/>
-        </w:rPr>
-        <w:t xml:space="preserve">Implemented dual-timer focus sessions, weekly/monthly reminder scheduling and a cache-first service worker for system notifications; built a JS ↔ Kotlin bridge so the same code runs in a native Android wrapper with exact alarms.</w:t>
-      </w:r>
-    </w:p>
-    <w:p>
-      <w:pPr>
-        <w:pStyle w:val="ListParagraph"/>
-        <w:numPr>
-          <w:ilvl w:val="0"/>
-          <w:numId w:val="2"/>
-        </w:numPr>
-        <w:spacing w:after="24"/>
-      </w:pPr>
-      <w:r>
-        <w:rPr>
-          <w:sz w:val="20"/>
-          <w:szCs w:val="20"/>
-        </w:rPr>
-        <w:t xml:space="preserve">Fixed input-focus loss under 1-second live re-renders with a targeted DOM-patch path instead of a full re-render.</w:t>
+        <w:t xml:space="preserve">Jul 2026 – present</w:t>
+      </w:r>
+    </w:p>
+    <w:p>
+      <w:pPr>
+        <w:pStyle w:val="ListParagraph"/>
+        <w:numPr>
+          <w:ilvl w:val="0"/>
+          <w:numId w:val="2"/>
+        </w:numPr>
+        <w:spacing w:after="24"/>
+      </w:pPr>
+      <w:r>
+        <w:rPr>
+          <w:sz w:val="20"/>
+          <w:szCs w:val="20"/>
+        </w:rPr>
+        <w:t xml:space="preserve">Building an Android planner for commercial release that packs goals, recurring targets and reminders into free minutes by an urgency × importance score; 10 tagged releases, the latest shaped by tester feedback.</w:t>
+      </w:r>
+    </w:p>
+    <w:p>
+      <w:pPr>
+        <w:pStyle w:val="ListParagraph"/>
+        <w:numPr>
+          <w:ilvl w:val="0"/>
+          <w:numId w:val="2"/>
+        </w:numPr>
+        <w:spacing w:after="24"/>
+      </w:pPr>
+      <w:r>
+        <w:rPr>
+          <w:sz w:val="20"/>
+          <w:szCs w:val="20"/>
+        </w:rPr>
+        <w:t xml:space="preserve">Vanilla-JS UI in a Kotlin WebView shell that owns exact alarms, reboot recovery and a foreground service keeping focus timers alive; started as an offline-first PWA.</w:t>
+      </w:r>
+    </w:p>
+    <w:p>
+      <w:pPr>
+        <w:pStyle w:val="ListParagraph"/>
+        <w:numPr>
+          <w:ilvl w:val="0"/>
+          <w:numId w:val="2"/>
+        </w:numPr>
+        <w:spacing w:after="24"/>
+      </w:pPr>
+      <w:r>
+        <w:rPr>
+          <w:sz w:val="20"/>
+          <w:szCs w:val="20"/>
+        </w:rPr>
+        <w:t xml:space="preserve">Set up CI that builds a shrunk release APK and runs the Kotlin and JavaScript test suites on every PR; tagged releases are signed and checked with apksigner.</w:t>
       </w:r>
     </w:p>
     <w:p>
@@ -792,38 +792,8 @@
           <w:sz w:val="18"/>
           <w:szCs w:val="18"/>
         </w:rPr>
-        <w:t xml:space="preserve">Live: </w:t>
-      </w:r>
-      <w:hyperlink w:history="1" r:id="rIdl1esekpajrij-hptmasbm">
-        <w:r>
-          <w:rPr>
-            <w:color w:val="1F3A5F"/>
-            <w:sz w:val="18"/>
-            <w:szCs w:val="18"/>
-            <w:u w:val="single"/>
-          </w:rPr>
-          <w:t xml:space="preserve">faraaz817.github.io/time-flow-web</w:t>
-        </w:r>
-      </w:hyperlink>
-      <w:r>
-        <w:rPr>
-          <w:color w:val="444444"/>
-          <w:sz w:val="18"/>
-          <w:szCs w:val="18"/>
-        </w:rPr>
-        <w:t xml:space="preserve">   ·   GitHub: </w:t>
-      </w:r>
-      <w:hyperlink w:history="1" r:id="rIdb2k_cz8mbvhowgyt5tlxs">
-        <w:r>
-          <w:rPr>
-            <w:color w:val="1F3A5F"/>
-            <w:sz w:val="18"/>
-            <w:szCs w:val="18"/>
-            <w:u w:val="single"/>
-          </w:rPr>
-          <w:t xml:space="preserve">github.com/faraaz817/time-flow-web</w:t>
-        </w:r>
-      </w:hyperlink>
+        <w:t xml:space="preserve">Closed source (in development for commercial release)  ·  demo on request</w:t>
+      </w:r>
     </w:p>
     <w:p>
       <w:pPr>
@@ -847,7 +817,7 @@
           <w:sz w:val="19"/>
           <w:szCs w:val="19"/>
         </w:rPr>
-        <w:t xml:space="preserve">  ·  Kotlin, Android 8–15, AlarmManager, JUnit</w:t>
+        <w:t xml:space="preserve">  ·  Kotlin, AlarmManager, JUnit</w:t>
       </w:r>
       <w:r>
         <w:tab/>
@@ -860,7 +830,7 @@
           <w:sz w:val="20"/>
           <w:szCs w:val="20"/>
         </w:rPr>
-        <w:t xml:space="preserve">Aug 2026</w:t>
+        <w:t xml:space="preserve">Aug – Oct 2026</w:t>
       </w:r>
     </w:p>
     <w:p>
@@ -895,6 +865,23 @@
           <w:szCs w:val="20"/>
         </w:rPr>
         <w:t xml:space="preserve">Wrote functional requirements (scope, decision log, acceptance criteria) before coding, then reviewed the code against them: fixed a critical AM/PM storage bug and a refresh alarm that stopped re-arming; unit-tested time parsing.</w:t>
+      </w:r>
+    </w:p>
+    <w:p>
+      <w:pPr>
+        <w:pStyle w:val="ListParagraph"/>
+        <w:numPr>
+          <w:ilvl w:val="0"/>
+          <w:numId w:val="2"/>
+        </w:numPr>
+        <w:spacing w:after="24"/>
+      </w:pPr>
+      <w:r>
+        <w:rPr>
+          <w:sz w:val="20"/>
+          <w:szCs w:val="20"/>
+        </w:rPr>
+        <w:t xml:space="preserve">When the timetable source began returning bot-check pages, kept alarms working by falling back to a bundled annual timetable behind a new unit-tested parser; added GitHub Actions to test, build and publish releases.</w:t>
       </w:r>
     </w:p>
     <w:p>
@@ -918,7 +905,7 @@
         </w:rPr>
         <w:t xml:space="preserve">GitHub: </w:t>
       </w:r>
-      <w:hyperlink w:history="1" r:id="rIdgvyq7ardko14imskxelkx">
+      <w:hyperlink w:history="1" r:id="rId_layyzsquoldrgfxodllb">
         <w:r>
           <w:rPr>
             <w:color w:val="1F3A5F"/>
@@ -1023,7 +1010,7 @@
         </w:rPr>
         <w:t xml:space="preserve">GitHub: </w:t>
       </w:r>
-      <w:hyperlink w:history="1" r:id="rId9mghyftxdldrkltueutcy">
+      <w:hyperlink w:history="1" r:id="rIdjlpfot4xtqdyuklm-lpyd">
         <w:r>
           <w:rPr>
             <w:color w:val="1F3A5F"/>
@@ -1082,7 +1069,7 @@
         </w:rPr>
         <w:t xml:space="preserve">Live: </w:t>
       </w:r>
-      <w:hyperlink w:history="1" r:id="rId5xh0jnyrz9d86ahutkq1j">
+      <w:hyperlink w:history="1" r:id="rIdbedjxyo5mvbqjgeouahrj">
         <w:r>
           <w:rPr>
             <w:color w:val="1F3A5F"/>
@@ -1171,7 +1158,7 @@
         </w:rPr>
         <w:t xml:space="preserve"> authored five reusable skills — CO-STAR requirements builder, Socratic tutor, better-way reviewer, skill sync, and a pikepdf CLI that unlocks signature-locked PDFs.  </w:t>
       </w:r>
-      <w:hyperlink w:history="1" r:id="rIdpyqlso-h4fhzgbrtzf8o4">
+      <w:hyperlink w:history="1" r:id="rId4pspvhogqcfh3gdgdtkcd">
         <w:r>
           <w:rPr>
             <w:color w:val="1F3A5F"/>
@@ -1271,7 +1258,7 @@
         </w:rPr>
         <w:t xml:space="preserve">, Vol. 9(12), pp. 43–51, Dec 2023 (ISSN 2321-3795, peer-reviewed). Benchmarked 5 edge-detection operators × 8 classifiers (40 combinations) as a lesion feature-extraction step on a 15,000-image, four-class maize dataset; best result Sobel + MLP at 94.75%. Implemented the Canny arm (OpenCV + scikit-learn, ten classifiers).  ↳ </w:t>
       </w:r>
-      <w:hyperlink w:history="1" r:id="rIdu22jtazlwkit9r3rj7rak">
+      <w:hyperlink w:history="1" r:id="rIdqfzpjjjsgwnxm0-epyop2">
         <w:r>
           <w:rPr>
             <w:color w:val="1F3A5F"/>
@@ -1289,7 +1276,7 @@
         </w:rPr>
         <w:t xml:space="preserve">   ·   Code: </w:t>
       </w:r>
-      <w:hyperlink w:history="1" r:id="rId_8cojtpkmekbglbzyqxxx">
+      <w:hyperlink w:history="1" r:id="rIdq_24ybr6xdqh4pxaeabi5">
         <w:r>
           <w:rPr>
             <w:color w:val="1F3A5F"/>
@@ -1460,10 +1447,6 @@
 </w:document>
 </file>
 
-<file path=word/comments.xml><?xml version="1.0" encoding="utf-8"?>
-<w:comments xmlns:cx="http://schemas.microsoft.com/office/drawing/2014/chartex" xmlns:cx1="http://schemas.microsoft.com/office/drawing/2015/9/8/chartex" xmlns:cx2="http://schemas.microsoft.com/office/drawing/2015/10/21/chartex" xmlns:cx3="http://schemas.microsoft.com/office/drawing/2016/5/9/chartex" xmlns:cx4="http://schemas.microsoft.com/office/drawing/2016/5/10/chartex" xmlns:cx5="http://schemas.microsoft.com/office/drawing/2016/5/11/chartex" xmlns:cx6="http://schemas.microsoft.com/office/drawing/2016/5/12/chartex" xmlns:cx7="http://schemas.microsoft.com/office/drawing/2016/5/13/chartex" xmlns:cx8="http://schemas.microsoft.com/office/drawing/2016/5/14/chartex" xmlns:mc="http://schemas.openxmlformats.org/markup-compatibility/2006" xmlns:aink="http://schemas.microsoft.com/office/drawing/2016/ink" xmlns:am3d="http://schemas.microsoft.com/office/drawing/2017/model3d" xmlns:o="urn:schemas-microsoft-com:office:office" xmlns:r="http://schemas.openxmlformats.org/officeDocument/2006/relationships" xmlns:m="http://schemas.openxmlformats.org/officeDocument/2006/math" xmlns:v="urn:schemas-microsoft-com:vml" xmlns:wp14="http://schemas.microsoft.com/office/word/2010/wordprocessingDrawing" xmlns:wp="http://schemas.openxmlformats.org/drawingml/2006/wordprocessingDrawing" xmlns:w10="urn:schemas-microsoft-com:office:word" xmlns:w="http://schemas.openxmlformats.org/wordprocessingml/2006/main" xmlns:w14="http://schemas.microsoft.com/office/word/2010/wordml" xmlns:w15="http://schemas.microsoft.com/office/word/2012/wordml" xmlns:w16cex="http://schemas.microsoft.com/office/word/2018/wordml/cex" xmlns:w16cid="http://schemas.microsoft.com/office/word/2016/wordml/cid" xmlns:w16="http://schemas.microsoft.com/office/word/2018/wordml" xmlns:w16sdtdh="http://schemas.microsoft.com/office/word/2020/wordml/sdtdatahash" xmlns:w16se="http://schemas.microsoft.com/office/word/2015/wordml/symex" xmlns:wpg="http://schemas.microsoft.com/office/word/2010/wordprocessingGroup" xmlns:wpi="http://schemas.microsoft.com/office/word/2010/wordprocessingInk" xmlns:wne="http://schemas.microsoft.com/office/word/2006/wordml" xmlns:wps="http://schemas.microsoft.com/office/word/2010/wordprocessingShape"/>
-</file>
-
 <file path=word/endnotes.xml><?xml version="1.0" encoding="utf-8"?>
 <w:endnotes xmlns:wpc="http://schemas.microsoft.com/office/word/2010/wordprocessingCanvas" xmlns:mc="http://schemas.openxmlformats.org/markup-compatibility/2006" xmlns:o="urn:schemas-microsoft-com:office:office" xmlns:r="http://schemas.openxmlformats.org/officeDocument/2006/relationships" xmlns:m="http://schemas.openxmlformats.org/officeDocument/2006/math" xmlns:v="urn:schemas-microsoft-com:vml" xmlns:wp14="http://schemas.microsoft.com/office/word/2010/wordprocessingDrawing" xmlns:wp="http://schemas.openxmlformats.org/drawingml/2006/wordprocessingDrawing" xmlns:w10="urn:schemas-microsoft-com:office:word" xmlns:w="http://schemas.openxmlformats.org/wordprocessingml/2006/main" xmlns:w14="http://schemas.microsoft.com/office/word/2010/wordml" xmlns:w15="http://schemas.microsoft.com/office/word/2012/wordml" xmlns:wpg="http://schemas.microsoft.com/office/word/2010/wordprocessingGroup" xmlns:wpi="http://schemas.microsoft.com/office/word/2010/wordprocessingInk" xmlns:wne="http://schemas.microsoft.com/office/word/2006/wordml" xmlns:wps="http://schemas.microsoft.com/office/word/2010/wordprocessingShape" mc:Ignorable="w14 w15 wp14">
   <w:endnote w:type="separator" w:id="-1">
@@ -1542,7 +1525,7 @@
 <w:numbering xmlns:wpc="http://schemas.microsoft.com/office/word/2010/wordprocessingCanvas" xmlns:mc="http://schemas.openxmlformats.org/markup-compatibility/2006" xmlns:o="urn:schemas-microsoft-com:office:office" xmlns:r="http://schemas.openxmlformats.org/officeDocument/2006/relationships" xmlns:m="http://schemas.openxmlformats.org/officeDocument/2006/math" xmlns:v="urn:schemas-microsoft-com:vml" xmlns:wp14="http://schemas.microsoft.com/office/word/2010/wordprocessingDrawing" xmlns:wp="http://schemas.openxmlformats.org/drawingml/2006/wordprocessingDrawing" xmlns:w10="urn:schemas-microsoft-com:office:word" xmlns:w="http://schemas.openxmlformats.org/wordprocessingml/2006/main" xmlns:w14="http://schemas.microsoft.com/office/word/2010/wordml" xmlns:w15="http://schemas.microsoft.com/office/word/2012/wordml" xmlns:wpg="http://schemas.microsoft.com/office/word/2010/wordprocessingGroup" xmlns:wpi="http://schemas.microsoft.com/office/word/2010/wordprocessingInk" xmlns:wne="http://schemas.microsoft.com/office/word/2006/wordml" xmlns:wps="http://schemas.microsoft.com/office/word/2010/wordprocessingShape" mc:Ignorable="w14 w15 wp14">
   <w:abstractNum w:abstractNumId="1" w15:restartNumberingAfterBreak="0">
     <w:multiLevelType w:val="hybridMultilevel"/>
-    <w:lvl w:ilvl="0" w15:tentative="1">
+    <w:lvl w:ilvl="0" w:tentative="1">
       <w:start w:val="1"/>
       <w:numFmt w:val="bullet"/>
       <w:lvlText w:val="●"/>
@@ -1551,7 +1534,7 @@
         <w:ind w:left="720" w:hanging="360"/>
       </w:pPr>
     </w:lvl>
-    <w:lvl w:ilvl="1" w15:tentative="1">
+    <w:lvl w:ilvl="1" w:tentative="1">
       <w:start w:val="1"/>
       <w:numFmt w:val="bullet"/>
       <w:lvlText w:val="○"/>
@@ -1560,7 +1543,7 @@
         <w:ind w:left="1440" w:hanging="360"/>
       </w:pPr>
     </w:lvl>
-    <w:lvl w:ilvl="2" w15:tentative="1">
+    <w:lvl w:ilvl="2" w:tentative="1">
       <w:start w:val="1"/>
       <w:numFmt w:val="bullet"/>
       <w:lvlText w:val="■"/>
@@ -1569,7 +1552,7 @@
         <w:ind w:left="2160" w:hanging="360"/>
       </w:pPr>
     </w:lvl>
-    <w:lvl w:ilvl="3" w15:tentative="1">
+    <w:lvl w:ilvl="3" w:tentative="1">
       <w:start w:val="1"/>
       <w:numFmt w:val="bullet"/>
       <w:lvlText w:val="●"/>
@@ -1578,7 +1561,7 @@
         <w:ind w:left="2880" w:hanging="360"/>
       </w:pPr>
     </w:lvl>
-    <w:lvl w:ilvl="4" w15:tentative="1">
+    <w:lvl w:ilvl="4" w:tentative="1">
       <w:start w:val="1"/>
       <w:numFmt w:val="bullet"/>
       <w:lvlText w:val="○"/>
@@ -1587,7 +1570,7 @@
         <w:ind w:left="3600" w:hanging="360"/>
       </w:pPr>
     </w:lvl>
-    <w:lvl w:ilvl="5" w15:tentative="1">
+    <w:lvl w:ilvl="5" w:tentative="1">
       <w:start w:val="1"/>
       <w:numFmt w:val="bullet"/>
       <w:lvlText w:val="■"/>
@@ -1596,7 +1579,7 @@
         <w:ind w:left="4320" w:hanging="360"/>
       </w:pPr>
     </w:lvl>
-    <w:lvl w:ilvl="6" w15:tentative="1">
+    <w:lvl w:ilvl="6" w:tentative="1">
       <w:start w:val="1"/>
       <w:numFmt w:val="bullet"/>
       <w:lvlText w:val="●"/>
@@ -1605,7 +1588,7 @@
         <w:ind w:left="5040" w:hanging="360"/>
       </w:pPr>
     </w:lvl>
-    <w:lvl w:ilvl="7" w15:tentative="1">
+    <w:lvl w:ilvl="7" w:tentative="1">
       <w:start w:val="1"/>
       <w:numFmt w:val="bullet"/>
       <w:lvlText w:val="●"/>
@@ -1614,7 +1597,7 @@
         <w:ind w:left="5760" w:hanging="360"/>
       </w:pPr>
     </w:lvl>
-    <w:lvl w:ilvl="8" w15:tentative="1">
+    <w:lvl w:ilvl="8" w:tentative="1">
       <w:start w:val="1"/>
       <w:numFmt w:val="bullet"/>
       <w:lvlText w:val="●"/>
@@ -1626,7 +1609,7 @@
   </w:abstractNum>
   <w:abstractNum w:abstractNumId="2" w15:restartNumberingAfterBreak="0">
     <w:multiLevelType w:val="hybridMultilevel"/>
-    <w:lvl w:ilvl="0" w15:tentative="1">
+    <w:lvl w:ilvl="0" w:tentative="1">
       <w:start w:val="1"/>
       <w:numFmt w:val="bullet"/>
       <w:lvlText w:val="•"/>
@@ -1663,6 +1646,25 @@
     </w:rPrDefault>
     <w:pPrDefault/>
   </w:docDefaults>
+  <w:style w:type="paragraph" w:styleId="Normal" w:default="1">
+    <w:name w:val="Normal"/>
+    <w:qFormat/>
+  </w:style>
+  <w:style w:type="table" w:styleId="TableNormal" w:default="true">
+    <w:name w:val="Normal Table"/>
+    <w:uiPriority w:val="99"/>
+    <w:semiHidden/>
+    <w:unhideWhenUsed/>
+    <w:tblPr>
+      <w:tblInd w:type="dxa" w:w="0"/>
+      <w:tblCellMar>
+        <w:top w:type="dxa" w:w="0"/>
+        <w:left w:type="dxa" w:w="108"/>
+        <w:bottom w:type="dxa" w:w="0"/>
+        <w:right w:type="dxa" w:w="108"/>
+      </w:tblCellMar>
+    </w:tblPr>
+  </w:style>
   <w:style w:type="paragraph" w:styleId="Title">
     <w:name w:val="Title"/>
     <w:basedOn w:val="Normal"/>
@@ -1835,4 +1837,294 @@
     </w:rPr>
   </w:style>
 </w:styles>
+</file>
+
+<file path=word/theme/theme1.xml><?xml version="1.0" encoding="utf-8"?>
+<a:theme xmlns:a="http://schemas.openxmlformats.org/drawingml/2006/main" name="Office Theme">
+  <a:themeElements>
+    <a:clrScheme name="Office">
+      <a:dk1>
+        <a:sysClr val="windowText" lastClr="000000"/>
+      </a:dk1>
+      <a:lt1>
+        <a:sysClr val="window" lastClr="FFFFFF"/>
+      </a:lt1>
+      <a:dk2>
+        <a:srgbClr val="44546A"/>
+      </a:dk2>
+      <a:lt2>
+        <a:srgbClr val="E7E6E6"/>
+      </a:lt2>
+      <a:accent1>
+        <a:srgbClr val="4472C4"/>
+      </a:accent1>
+      <a:accent2>
+        <a:srgbClr val="ED7D31"/>
+      </a:accent2>
+      <a:accent3>
+        <a:srgbClr val="A5A5A5"/>
+      </a:accent3>
+      <a:accent4>
+        <a:srgbClr val="FFC000"/>
+      </a:accent4>
+      <a:accent5>
+        <a:srgbClr val="5B9BD5"/>
+      </a:accent5>
+      <a:accent6>
+        <a:srgbClr val="70AD47"/>
+      </a:accent6>
+      <a:hlink>
+        <a:srgbClr val="0563C1"/>
+      </a:hlink>
+      <a:folHlink>
+        <a:srgbClr val="954F72"/>
+      </a:folHlink>
+    </a:clrScheme>
+    <a:fontScheme name="Office">
+      <a:majorFont>
+        <a:latin typeface="Calibri Light" panose="020F0302020204030204"/>
+        <a:ea typeface=""/>
+        <a:cs typeface=""/>
+        <a:font script="Jpan" typeface="游ゴシック Light"/>
+        <a:font script="Hang" typeface="맑은 고딕"/>
+        <a:font script="Hans" typeface="等线 Light"/>
+        <a:font script="Hant" typeface="新細明體"/>
+        <a:font script="Arab" typeface="Times New Roman"/>
+        <a:font script="Hebr" typeface="Times New Roman"/>
+        <a:font script="Thai" typeface="Angsana New"/>
+        <a:font script="Ethi" typeface="Nyala"/>
+        <a:font script="Beng" typeface="Vrinda"/>
+        <a:font script="Gujr" typeface="Shruti"/>
+        <a:font script="Khmr" typeface="MoolBoran"/>
+        <a:font script="Knda" typeface="Tunga"/>
+        <a:font script="Guru" typeface="Raavi"/>
+        <a:font script="Cans" typeface="Euphemia"/>
+        <a:font script="Cher" typeface="Plantagenet Cherokee"/>
+        <a:font script="Yiii" typeface="Microsoft Yi Baiti"/>
+        <a:font script="Tibt" typeface="Microsoft Himalaya"/>
+        <a:font script="Thaa" typeface="MV Boli"/>
+        <a:font script="Deva" typeface="Mangal"/>
+        <a:font script="Telu" typeface="Gautami"/>
+        <a:font script="Taml" typeface="Latha"/>
+        <a:font script="Syrc" typeface="Estrangelo Edessa"/>
+        <a:font script="Orya" typeface="Kalinga"/>
+        <a:font script="Mlym" typeface="Kartika"/>
+        <a:font script="Laoo" typeface="DokChampa"/>
+        <a:font script="Sinh" typeface="Iskoola Pota"/>
+        <a:font script="Mong" typeface="Mongolian Baiti"/>
+        <a:font script="Viet" typeface="Times New Roman"/>
+        <a:font script="Uigh" typeface="Microsoft Uighur"/>
+        <a:font script="Geor" typeface="Sylfaen"/>
+        <a:font script="Armn" typeface="Arial"/>
+        <a:font script="Bugi" typeface="Leelawadee UI"/>
+        <a:font script="Bopo" typeface="Microsoft JhengHei"/>
+        <a:font script="Java" typeface="Javanese Text"/>
+        <a:font script="Lisu" typeface="Segoe UI"/>
+        <a:font script="Mymr" typeface="Myanmar Text"/>
+        <a:font script="Nkoo" typeface="Ebrima"/>
+        <a:font script="Olck" typeface="Nirmala UI"/>
+        <a:font script="Osma" typeface="Ebrima"/>
+        <a:font script="Phag" typeface="Phagspa"/>
+        <a:font script="Syrn" typeface="Estrangelo Edessa"/>
+        <a:font script="Syrj" typeface="Estrangelo Edessa"/>
+        <a:font script="Syre" typeface="Estrangelo Edessa"/>
+        <a:font script="Sora" typeface="Nirmala UI"/>
+        <a:font script="Tale" typeface="Microsoft Tai Le"/>
+        <a:font script="Talu" typeface="Microsoft New Tai Lue"/>
+        <a:font script="Tfng" typeface="Ebrima"/>
+      </a:majorFont>
+      <a:minorFont>
+        <a:latin typeface="Calibri" panose="020F0502020204030204"/>
+        <a:ea typeface=""/>
+        <a:cs typeface=""/>
+        <a:font script="Jpan" typeface="游明朝"/>
+        <a:font script="Hang" typeface="맑은 고딕"/>
+        <a:font script="Hans" typeface="等线"/>
+        <a:font script="Hant" typeface="新細明體"/>
+        <a:font script="Arab" typeface="Arial"/>
+        <a:font script="Hebr" typeface="Arial"/>
+        <a:font script="Thai" typeface="Cordia New"/>
+        <a:font script="Ethi" typeface="Nyala"/>
+        <a:font script="Beng" typeface="Vrinda"/>
+        <a:font script="Gujr" typeface="Shruti"/>
+        <a:font script="Khmr" typeface="DaunPenh"/>
+        <a:font script="Knda" typeface="Tunga"/>
+        <a:font script="Guru" typeface="Raavi"/>
+        <a:font script="Cans" typeface="Euphemia"/>
+        <a:font script="Cher" typeface="Plantagenet Cherokee"/>
+        <a:font script="Yiii" typeface="Microsoft Yi Baiti"/>
+        <a:font script="Tibt" typeface="Microsoft Himalaya"/>
+        <a:font script="Thaa" typeface="MV Boli"/>
+        <a:font script="Deva" typeface="Mangal"/>
+        <a:font script="Telu" typeface="Gautami"/>
+        <a:font script="Taml" typeface="Latha"/>
+        <a:font script="Syrc" typeface="Estrangelo Edessa"/>
+        <a:font script="Orya" typeface="Kalinga"/>
+        <a:font script="Mlym" typeface="Kartika"/>
+        <a:font script="Laoo" typeface="DokChampa"/>
+        <a:font script="Sinh" typeface="Iskoola Pota"/>
+        <a:font script="Mong" typeface="Mongolian Baiti"/>
+        <a:font script="Viet" typeface="Arial"/>
+        <a:font script="Uigh" typeface="Microsoft Uighur"/>
+        <a:font script="Geor" typeface="Sylfaen"/>
+        <a:font script="Armn" typeface="Arial"/>
+        <a:font script="Bugi" typeface="Leelawadee UI"/>
+        <a:font script="Bopo" typeface="Microsoft JhengHei"/>
+        <a:font script="Java" typeface="Javanese Text"/>
+        <a:font script="Lisu" typeface="Segoe UI"/>
+        <a:font script="Mymr" typeface="Myanmar Text"/>
+        <a:font script="Nkoo" typeface="Ebrima"/>
+        <a:font script="Olck" typeface="Nirmala UI"/>
+        <a:font script="Osma" typeface="Ebrima"/>
+        <a:font script="Phag" typeface="Phagspa"/>
+        <a:font script="Syrn" typeface="Estrangelo Edessa"/>
+        <a:font script="Syrj" typeface="Estrangelo Edessa"/>
+        <a:font script="Syre" typeface="Estrangelo Edessa"/>
+        <a:font script="Sora" typeface="Nirmala UI"/>
+        <a:font script="Tale" typeface="Microsoft Tai Le"/>
+        <a:font script="Talu" typeface="Microsoft New Tai Lue"/>
+        <a:font script="Tfng" typeface="Ebrima"/>
+      </a:minorFont>
+    </a:fontScheme>
+    <a:fmtScheme name="Office">
+      <a:fillStyleLst>
+        <a:solidFill>
+          <a:schemeClr val="phClr"/>
+        </a:solidFill>
+        <a:gradFill rotWithShape="true">
+          <a:gsLst>
+            <a:gs pos="0">
+              <a:schemeClr val="phClr">
+                <a:lumMod val="110000"/>
+                <a:satMod val="105000"/>
+                <a:tint val="67000"/>
+              </a:schemeClr>
+            </a:gs>
+            <a:gs pos="50000">
+              <a:schemeClr val="phClr">
+                <a:lumMod val="105000"/>
+                <a:satMod val="103000"/>
+                <a:tint val="73000"/>
+              </a:schemeClr>
+            </a:gs>
+            <a:gs pos="100000">
+              <a:schemeClr val="phClr">
+                <a:lumMod val="105000"/>
+                <a:satMod val="109000"/>
+                <a:tint val="81000"/>
+              </a:schemeClr>
+            </a:gs>
+          </a:gsLst>
+          <a:lin ang="5400000" scaled="false"/>
+        </a:gradFill>
+        <a:gradFill rotWithShape="true">
+          <a:gsLst>
+            <a:gs pos="0">
+              <a:schemeClr val="phClr">
+                <a:satMod val="103000"/>
+                <a:lumMod val="102000"/>
+                <a:tint val="94000"/>
+              </a:schemeClr>
+            </a:gs>
+            <a:gs pos="50000">
+              <a:schemeClr val="phClr">
+                <a:satMod val="110000"/>
+                <a:lumMod val="100000"/>
+                <a:shade val="100000"/>
+              </a:schemeClr>
+            </a:gs>
+            <a:gs pos="100000">
+              <a:schemeClr val="phClr">
+                <a:lumMod val="99000"/>
+                <a:satMod val="120000"/>
+                <a:shade val="78000"/>
+              </a:schemeClr>
+            </a:gs>
+          </a:gsLst>
+          <a:lin ang="5400000" scaled="false"/>
+        </a:gradFill>
+      </a:fillStyleLst>
+      <a:lnStyleLst>
+        <a:ln w="6350" cap="flat" cmpd="sng" algn="ctr">
+          <a:solidFill>
+            <a:schemeClr val="phClr"/>
+          </a:solidFill>
+          <a:prstDash val="solid"/>
+          <a:miter lim="800000"/>
+        </a:ln>
+        <a:ln w="12700" cap="flat" cmpd="sng" algn="ctr">
+          <a:solidFill>
+            <a:schemeClr val="phClr"/>
+          </a:solidFill>
+          <a:prstDash val="solid"/>
+          <a:miter lim="800000"/>
+        </a:ln>
+        <a:ln w="19050" cap="flat" cmpd="sng" algn="ctr">
+          <a:solidFill>
+            <a:schemeClr val="phClr"/>
+          </a:solidFill>
+          <a:prstDash val="solid"/>
+          <a:miter lim="800000"/>
+        </a:ln>
+      </a:lnStyleLst>
+      <a:effectStyleLst>
+        <a:effectStyle>
+          <a:effectLst/>
+        </a:effectStyle>
+        <a:effectStyle>
+          <a:effectLst/>
+        </a:effectStyle>
+        <a:effectStyle>
+          <a:effectLst>
+            <a:outerShdw blurRad="57150" dist="19050" dir="5400000" algn="ctr" rotWithShape="false">
+              <a:srgbClr val="000000">
+                <a:alpha val="63000"/>
+              </a:srgbClr>
+            </a:outerShdw>
+          </a:effectLst>
+        </a:effectStyle>
+      </a:effectStyleLst>
+      <a:bgFillStyleLst>
+        <a:solidFill>
+          <a:schemeClr val="phClr"/>
+        </a:solidFill>
+        <a:solidFill>
+          <a:schemeClr val="phClr">
+            <a:tint val="95000"/>
+            <a:satMod val="170000"/>
+          </a:schemeClr>
+        </a:solidFill>
+        <a:gradFill rotWithShape="true">
+          <a:gsLst>
+            <a:gs pos="0">
+              <a:schemeClr val="phClr">
+                <a:tint val="93000"/>
+                <a:satMod val="150000"/>
+                <a:shade val="98000"/>
+                <a:lumMod val="102000"/>
+              </a:schemeClr>
+            </a:gs>
+            <a:gs pos="50000">
+              <a:schemeClr val="phClr">
+                <a:tint val="98000"/>
+                <a:satMod val="130000"/>
+                <a:shade val="90000"/>
+                <a:lumMod val="103000"/>
+              </a:schemeClr>
+            </a:gs>
+            <a:gs pos="100000">
+              <a:schemeClr val="phClr">
+                <a:shade val="63000"/>
+                <a:satMod val="120000"/>
+              </a:schemeClr>
+            </a:gs>
+          </a:gsLst>
+          <a:lin ang="5400000" scaled="false"/>
+        </a:gradFill>
+      </a:bgFillStyleLst>
+    </a:fmtScheme>
+  </a:themeElements>
+  <a:objectDefaults/>
+  <a:extraClrSchemeLst/>
+</a:theme>
 </file>
</xml_diff>

<commit_message>
Add the Vayaa internship (Full-Stack Developer Intern, Sep 2026 – present)
- Source/Vayaa/README.md: write-up from the private Vaya repo — the
  requirements / decision / progress logs, the Axum contact API with
  server-side validation and a 16 KB body limit, who did what, and the
  limits (not deployed, no database, no automated tests). Backend
  rebuilt and every documented response re-verified with curl today.
- base_resume: new Experience entry; Rust and React in skills; profile
  rewritten to four lines to include it; RMIT coursework line shortened
  so the degree no longer splits across pages. Re-rendered (2 pages).
- Source index, timeline and GitHub audit updated.

Co-Authored-By: Claude Opus 5.5 <noreply@anthropic.com>
Claude-Session: https://claude.ai/code/session_018K48sPd6fZ6f4RxmdVC7MK
</commit_message>
<xml_diff>
--- a/Faraaz_Mohammed_Resume_Base.docx
+++ b/Faraaz_Mohammed_Resume_Base.docx
@@ -37,7 +37,7 @@
         <w:spacing w:after="20"/>
         <w:jc w:val="center"/>
       </w:pPr>
-      <w:hyperlink w:history="1" r:id="rIdtni-anofzlzifxwdxuyhw">
+      <w:hyperlink w:history="1" r:id="rIdyj9gzcvq-xhl__fnzu0ea">
         <w:r>
           <w:rPr>
             <w:color w:val="1F3A5F"/>
@@ -56,7 +56,7 @@
         </w:rPr>
         <w:t xml:space="preserve">  •  </w:t>
       </w:r>
-      <w:hyperlink w:history="1" r:id="rId9gx5y2h7rvoe6jn5sdghn">
+      <w:hyperlink w:history="1" r:id="rIdacblhwl8egbzlpyxrpnch">
         <w:r>
           <w:rPr>
             <w:color w:val="1F3A5F"/>
@@ -75,7 +75,7 @@
         </w:rPr>
         <w:t xml:space="preserve">  •  </w:t>
       </w:r>
-      <w:hyperlink w:history="1" r:id="rIdit-znedzogu5sf_322k54">
+      <w:hyperlink w:history="1" r:id="rIdbqwf5j0-qvhzmkda0z2y6">
         <w:r>
           <w:rPr>
             <w:color w:val="1F3A5F"/>
@@ -131,7 +131,7 @@
           <w:sz w:val="20"/>
           <w:szCs w:val="20"/>
         </w:rPr>
-        <w:t xml:space="preserve">Master of Artificial Intelligence graduate (RMIT, 2026) with a B.Tech in IT and an AI/ML engineering internship delivering geospatial ML pipelines at national scale. Co-author of a peer-reviewed computer-vision paper. Works end to end — requirements, code, tests, review — across Python ML, Android (Kotlin) and web; built two Android apps (one in community use) and an MCP-based LLM tool in 2026. Seeking a graduate AI/ML or software engineering role anywhere in Australia.</w:t>
+        <w:t xml:space="preserve">Master of Artificial Intelligence graduate (RMIT, 2026) with a B.Tech in IT; full-stack developer intern at Vayaa after an AI/ML engineering internship delivering geospatial ML pipelines at national scale. Co-author of a peer-reviewed computer-vision paper. Works end to end — requirements, code, tests, review — across Python ML, Rust, Android and web; built two Android apps and an MCP-based LLM tool in 2026. Seeking graduate AI/ML or software engineering roles across Australia.</w:t>
       </w:r>
     </w:p>
     <w:p>
@@ -171,7 +171,7 @@
           <w:sz w:val="20"/>
           <w:szCs w:val="20"/>
         </w:rPr>
-        <w:t xml:space="preserve">Python (primary), Kotlin, JavaScript, TypeScript, SQL, Prolog / ASP (Clingo), JCL, Bash</w:t>
+        <w:t xml:space="preserve">Python (primary), Kotlin, JavaScript, TypeScript, Rust, SQL, Prolog / ASP (Clingo), JCL, Bash</w:t>
       </w:r>
     </w:p>
     <w:p>
@@ -234,7 +234,7 @@
           <w:sz w:val="20"/>
           <w:szCs w:val="20"/>
         </w:rPr>
-        <w:t xml:space="preserve">Android (Kotlin, AlarmManager, BroadcastReceiver, notification channels, Gradle KTS, JUnit), PWA (service workers, Web Notifications), Node.js, Next.js, Prisma, REST/JSON integration</w:t>
+        <w:t xml:space="preserve">Android (Kotlin, AlarmManager, BroadcastReceiver, notification channels, Gradle KTS, JUnit), Rust web APIs (Axum, Tokio, serde), React, PWA (service workers), Node.js, Next.js, Prisma, REST/JSON</w:t>
       </w:r>
     </w:p>
     <w:p>
@@ -312,7 +312,7 @@
           <w:sz w:val="21"/>
           <w:szCs w:val="21"/>
         </w:rPr>
-        <w:t xml:space="preserve">AI/ML Engineering Intern — Prodegee</w:t>
+        <w:t xml:space="preserve">Full-Stack Developer Intern — Vayaa</w:t>
       </w:r>
       <w:r>
         <w:tab/>
@@ -325,7 +325,7 @@
           <w:sz w:val="20"/>
           <w:szCs w:val="20"/>
         </w:rPr>
-        <w:t xml:space="preserve">Mar 2026 – Jun 2026</w:t>
+        <w:t xml:space="preserve">Sep 2026 – present</w:t>
       </w:r>
     </w:p>
     <w:p>
@@ -338,143 +338,58 @@
           <w:sz w:val="19"/>
           <w:szCs w:val="19"/>
         </w:rPr>
-        <w:t xml:space="preserve">Remote, Melbourne  ·  RMIT industry capstone, Team DS4 — building-footprint inference for off-grid electrification planning</w:t>
-      </w:r>
-    </w:p>
-    <w:p>
-      <w:pPr>
-        <w:pStyle w:val="ListParagraph"/>
-        <w:numPr>
-          <w:ilvl w:val="0"/>
-          <w:numId w:val="2"/>
-        </w:numPr>
-        <w:spacing w:after="24"/>
-      </w:pPr>
-      <w:r>
-        <w:rPr>
-          <w:sz w:val="20"/>
-          <w:szCs w:val="20"/>
-        </w:rPr>
-        <w:t xml:space="preserve">Designed and built the school-geolocation algorithm at the core of the team's pipeline (7.2M Overture building polygons, BFS spatial clustering, composite scoring); ran it on 18,121 schools in Côte d'Ivoire and ported it to Burundi and Chad.</w:t>
-      </w:r>
-    </w:p>
-    <w:p>
-      <w:pPr>
-        <w:pStyle w:val="ListParagraph"/>
-        <w:numPr>
-          <w:ilvl w:val="0"/>
-          <w:numId w:val="2"/>
-        </w:numPr>
-        <w:spacing w:after="24"/>
-      </w:pPr>
-      <w:r>
-        <w:rPr>
-          <w:sz w:val="20"/>
-          <w:szCs w:val="20"/>
-        </w:rPr>
-        <w:t xml:space="preserve">Replaced a binary distance cutoff with exponential-decay scoring and a weighted confidence score; added per-country sigmoid normalisation so one threshold works in all three countries; authored cross-team handoff contracts.</w:t>
-      </w:r>
-    </w:p>
-    <w:p>
-      <w:pPr>
-        <w:pStyle w:val="ListParagraph"/>
-        <w:numPr>
-          <w:ilvl w:val="0"/>
-          <w:numId w:val="2"/>
-        </w:numPr>
-        <w:spacing w:after="24"/>
-      </w:pPr>
-      <w:r>
-        <w:rPr>
-          <w:sz w:val="20"/>
-          <w:szCs w:val="20"/>
-        </w:rPr>
-        <w:t xml:space="preserve">Built a ±20% sensitivity harness that identified cluster radius as the dominant parameter (±36–44% swing across 191 villages), driving a 75 → 200 m recalibration that fixed a 90%+ household under-count (0.069 → 0.415).</w:t>
-      </w:r>
-    </w:p>
-    <w:p>
-      <w:pPr>
-        <w:pStyle w:val="ListParagraph"/>
-        <w:numPr>
-          <w:ilvl w:val="0"/>
-          <w:numId w:val="2"/>
-        </w:numPr>
-        <w:spacing w:after="24"/>
-      </w:pPr>
-      <w:r>
-        <w:rPr>
-          <w:sz w:val="20"/>
-          <w:szCs w:val="20"/>
-        </w:rPr>
-        <w:t xml:space="preserve">Built an IoU evaluation harness for compound polygons and traced all three generators' failures to a ~35× over-scoped upstream cluster rather than a fitting fault, which redirected the next assignment.</w:t>
-      </w:r>
-    </w:p>
-    <w:p>
-      <w:pPr>
-        <w:pStyle w:val="ListParagraph"/>
-        <w:numPr>
-          <w:ilvl w:val="0"/>
-          <w:numId w:val="2"/>
-        </w:numPr>
-        <w:spacing w:after="24"/>
-      </w:pPr>
-      <w:r>
-        <w:rPr>
-          <w:sz w:val="20"/>
-          <w:szCs w:val="20"/>
-        </w:rPr>
-        <w:t xml:space="preserve">Ran footprint inference across 200 villages in 7 Mauritanian Wilayas and trained an XGBoost multi-output tier regressor; documented that its 0.816 "confidence" measured agreement with the training heuristic, not accuracy.</w:t>
-      </w:r>
-    </w:p>
-    <w:p>
-      <w:pPr>
-        <w:pStyle w:val="ListParagraph"/>
-        <w:numPr>
-          <w:ilvl w:val="0"/>
-          <w:numId w:val="2"/>
-        </w:numPr>
-        <w:spacing w:after="24"/>
-      </w:pPr>
-      <w:r>
-        <w:rPr>
-          <w:sz w:val="20"/>
-          <w:szCs w:val="20"/>
-        </w:rPr>
-        <w:t xml:space="preserve">Co-built a 40-school satellite-verified ground-truth set and used it to correct a published baseline (6–13% → 37%); published a negative result showing a proximity penalty hurt accuracy at every threshold.</w:t>
-      </w:r>
-    </w:p>
-    <w:p>
-      <w:pPr>
-        <w:pStyle w:val="ListParagraph"/>
-        <w:numPr>
-          <w:ilvl w:val="0"/>
-          <w:numId w:val="2"/>
-        </w:numPr>
-        <w:spacing w:after="24"/>
-      </w:pPr>
-      <w:r>
-        <w:rPr>
-          <w:sz w:val="20"/>
-          <w:szCs w:val="20"/>
-        </w:rPr>
-        <w:t xml:space="preserve">Led 3 of 10 team assignments and was primary author of 3 of 4 formal deliverables (68 commits, 7 peer reviews); pinned upstream inputs by commit SHA for reproducible re-runs and wrote the semester-2 handoff memo.</w:t>
-      </w:r>
-    </w:p>
-    <w:p>
-      <w:pPr>
-        <w:pStyle w:val="ListParagraph"/>
-        <w:numPr>
-          <w:ilvl w:val="0"/>
-          <w:numId w:val="2"/>
-        </w:numPr>
-        <w:spacing w:after="24"/>
-      </w:pPr>
-      <w:r>
-        <w:rPr>
-          <w:sz w:val="20"/>
-          <w:szCs w:val="20"/>
-        </w:rPr>
-        <w:t xml:space="preserve">Built a Claude API model router that classifies task complexity with a cheap Haiku call and routes to Haiku / Sonnet / Opus, keeping cost proportional to difficulty.</w:t>
+        <w:t xml:space="preserve">Melbourne, VIC  ·  hybrid  ·  company website: React + TypeScript frontend, Rust (Axum) backend, Docker then AWS</w:t>
+      </w:r>
+    </w:p>
+    <w:p>
+      <w:pPr>
+        <w:pStyle w:val="ListParagraph"/>
+        <w:numPr>
+          <w:ilvl w:val="0"/>
+          <w:numId w:val="2"/>
+        </w:numPr>
+        <w:spacing w:after="24"/>
+      </w:pPr>
+      <w:r>
+        <w:rPr>
+          <w:sz w:val="20"/>
+          <w:szCs w:val="20"/>
+        </w:rPr>
+        <w:t xml:space="preserve">Building the company's website from a mentor's brief; turned each plain-language request into numbered functional and non-functional requirements and kept a decision log (choice, alternatives, cost) for every design call.</w:t>
+      </w:r>
+    </w:p>
+    <w:p>
+      <w:pPr>
+        <w:pStyle w:val="ListParagraph"/>
+        <w:numPr>
+          <w:ilvl w:val="0"/>
+          <w:numId w:val="2"/>
+        </w:numPr>
+        <w:spacing w:after="24"/>
+      </w:pPr>
+      <w:r>
+        <w:rPr>
+          <w:sz w:val="20"/>
+          <w:szCs w:val="20"/>
+        </w:rPr>
+        <w:t xml:space="preserve">Built the Rust backend's contact-enquiry API: server-side validation that reports every failed rule at once and converts raw input into a clean type, so only checked data can reach the database.</w:t>
+      </w:r>
+    </w:p>
+    <w:p>
+      <w:pPr>
+        <w:pStyle w:val="ListParagraph"/>
+        <w:numPr>
+          <w:ilvl w:val="0"/>
+          <w:numId w:val="2"/>
+        </w:numPr>
+        <w:spacing w:after="24"/>
+      </w:pPr>
+      <w:r>
+        <w:rPr>
+          <w:sz w:val="20"/>
+          <w:szCs w:val="20"/>
+        </w:rPr>
+        <w:t xml:space="preserve">Capped request bodies at 16 KB so oversized payloads are refused before parsing, limited CORS to the frontend's origin, and verified the 200 / 400 / 413 / 422 paths with curl.</w:t>
       </w:r>
     </w:p>
     <w:p>
@@ -497,7 +412,7 @@
           <w:sz w:val="19"/>
           <w:szCs w:val="19"/>
         </w:rPr>
-        <w:t xml:space="preserve"> Python, GeoPandas, Shapely, scikit-learn, XGBoost, pandas, Kestra, QGIS, GeoPackage, Git, Claude Code (MCP, hooks)</w:t>
+        <w:t xml:space="preserve"> Rust, Axum, Tokio, serde, React 19, TypeScript, Vite, Git, Claude Code</w:t>
       </w:r>
     </w:p>
     <w:p>
@@ -514,6 +429,208 @@
           <w:sz w:val="21"/>
           <w:szCs w:val="21"/>
         </w:rPr>
+        <w:t xml:space="preserve">AI/ML Engineering Intern — Prodegee</w:t>
+      </w:r>
+      <w:r>
+        <w:tab/>
+      </w:r>
+      <w:r>
+        <w:rPr>
+          <w:i/>
+          <w:iCs/>
+          <w:color w:val="444444"/>
+          <w:sz w:val="20"/>
+          <w:szCs w:val="20"/>
+        </w:rPr>
+        <w:t xml:space="preserve">Mar 2026 – Jun 2026</w:t>
+      </w:r>
+    </w:p>
+    <w:p>
+      <w:pPr>
+        <w:spacing w:after="30"/>
+      </w:pPr>
+      <w:r>
+        <w:rPr>
+          <w:color w:val="444444"/>
+          <w:sz w:val="19"/>
+          <w:szCs w:val="19"/>
+        </w:rPr>
+        <w:t xml:space="preserve">Remote, Melbourne  ·  RMIT industry capstone, Team DS4 — building-footprint inference for off-grid electrification planning</w:t>
+      </w:r>
+    </w:p>
+    <w:p>
+      <w:pPr>
+        <w:pStyle w:val="ListParagraph"/>
+        <w:numPr>
+          <w:ilvl w:val="0"/>
+          <w:numId w:val="2"/>
+        </w:numPr>
+        <w:spacing w:after="24"/>
+      </w:pPr>
+      <w:r>
+        <w:rPr>
+          <w:sz w:val="20"/>
+          <w:szCs w:val="20"/>
+        </w:rPr>
+        <w:t xml:space="preserve">Designed and built the school-geolocation algorithm at the core of the team's pipeline (7.2M Overture building polygons, BFS spatial clustering, composite scoring); ran it on 18,121 schools in Côte d'Ivoire and ported it to Burundi and Chad.</w:t>
+      </w:r>
+    </w:p>
+    <w:p>
+      <w:pPr>
+        <w:pStyle w:val="ListParagraph"/>
+        <w:numPr>
+          <w:ilvl w:val="0"/>
+          <w:numId w:val="2"/>
+        </w:numPr>
+        <w:spacing w:after="24"/>
+      </w:pPr>
+      <w:r>
+        <w:rPr>
+          <w:sz w:val="20"/>
+          <w:szCs w:val="20"/>
+        </w:rPr>
+        <w:t xml:space="preserve">Replaced a binary distance cutoff with exponential-decay scoring and a weighted confidence score; added per-country sigmoid normalisation so one threshold works in all three countries; authored cross-team handoff contracts.</w:t>
+      </w:r>
+    </w:p>
+    <w:p>
+      <w:pPr>
+        <w:pStyle w:val="ListParagraph"/>
+        <w:numPr>
+          <w:ilvl w:val="0"/>
+          <w:numId w:val="2"/>
+        </w:numPr>
+        <w:spacing w:after="24"/>
+      </w:pPr>
+      <w:r>
+        <w:rPr>
+          <w:sz w:val="20"/>
+          <w:szCs w:val="20"/>
+        </w:rPr>
+        <w:t xml:space="preserve">Built a ±20% sensitivity harness that identified cluster radius as the dominant parameter (±36–44% swing across 191 villages), driving a 75 → 200 m recalibration that fixed a 90%+ household under-count (0.069 → 0.415).</w:t>
+      </w:r>
+    </w:p>
+    <w:p>
+      <w:pPr>
+        <w:pStyle w:val="ListParagraph"/>
+        <w:numPr>
+          <w:ilvl w:val="0"/>
+          <w:numId w:val="2"/>
+        </w:numPr>
+        <w:spacing w:after="24"/>
+      </w:pPr>
+      <w:r>
+        <w:rPr>
+          <w:sz w:val="20"/>
+          <w:szCs w:val="20"/>
+        </w:rPr>
+        <w:t xml:space="preserve">Built an IoU evaluation harness for compound polygons and traced all three generators' failures to a ~35× over-scoped upstream cluster rather than a fitting fault, which redirected the next assignment.</w:t>
+      </w:r>
+    </w:p>
+    <w:p>
+      <w:pPr>
+        <w:pStyle w:val="ListParagraph"/>
+        <w:numPr>
+          <w:ilvl w:val="0"/>
+          <w:numId w:val="2"/>
+        </w:numPr>
+        <w:spacing w:after="24"/>
+      </w:pPr>
+      <w:r>
+        <w:rPr>
+          <w:sz w:val="20"/>
+          <w:szCs w:val="20"/>
+        </w:rPr>
+        <w:t xml:space="preserve">Ran footprint inference across 200 villages in 7 Mauritanian Wilayas and trained an XGBoost multi-output tier regressor; documented that its 0.816 "confidence" measured agreement with the training heuristic, not accuracy.</w:t>
+      </w:r>
+    </w:p>
+    <w:p>
+      <w:pPr>
+        <w:pStyle w:val="ListParagraph"/>
+        <w:numPr>
+          <w:ilvl w:val="0"/>
+          <w:numId w:val="2"/>
+        </w:numPr>
+        <w:spacing w:after="24"/>
+      </w:pPr>
+      <w:r>
+        <w:rPr>
+          <w:sz w:val="20"/>
+          <w:szCs w:val="20"/>
+        </w:rPr>
+        <w:t xml:space="preserve">Co-built a 40-school satellite-verified ground-truth set and used it to correct a published baseline (6–13% → 37%); published a negative result showing a proximity penalty hurt accuracy at every threshold.</w:t>
+      </w:r>
+    </w:p>
+    <w:p>
+      <w:pPr>
+        <w:pStyle w:val="ListParagraph"/>
+        <w:numPr>
+          <w:ilvl w:val="0"/>
+          <w:numId w:val="2"/>
+        </w:numPr>
+        <w:spacing w:after="24"/>
+      </w:pPr>
+      <w:r>
+        <w:rPr>
+          <w:sz w:val="20"/>
+          <w:szCs w:val="20"/>
+        </w:rPr>
+        <w:t xml:space="preserve">Led 3 of 10 team assignments and was primary author of 3 of 4 formal deliverables (68 commits, 7 peer reviews); pinned upstream inputs by commit SHA for reproducible re-runs and wrote the semester-2 handoff memo.</w:t>
+      </w:r>
+    </w:p>
+    <w:p>
+      <w:pPr>
+        <w:pStyle w:val="ListParagraph"/>
+        <w:numPr>
+          <w:ilvl w:val="0"/>
+          <w:numId w:val="2"/>
+        </w:numPr>
+        <w:spacing w:after="24"/>
+      </w:pPr>
+      <w:r>
+        <w:rPr>
+          <w:sz w:val="20"/>
+          <w:szCs w:val="20"/>
+        </w:rPr>
+        <w:t xml:space="preserve">Built a Claude API model router that classifies task complexity with a cheap Haiku call and routes to Haiku / Sonnet / Opus, keeping cost proportional to difficulty.</w:t>
+      </w:r>
+    </w:p>
+    <w:p>
+      <w:pPr>
+        <w:spacing w:after="30"/>
+      </w:pPr>
+      <w:r>
+        <w:rPr>
+          <w:b/>
+          <w:bCs/>
+          <w:color w:val="444444"/>
+          <w:sz w:val="19"/>
+          <w:szCs w:val="19"/>
+        </w:rPr>
+        <w:t xml:space="preserve">Tools:</w:t>
+      </w:r>
+      <w:r>
+        <w:rPr>
+          <w:color w:val="444444"/>
+          <w:sz w:val="19"/>
+          <w:szCs w:val="19"/>
+        </w:rPr>
+        <w:t xml:space="preserve"> Python, GeoPandas, Shapely, scikit-learn, XGBoost, pandas, Kestra, QGIS, GeoPackage, Git, Claude Code (MCP, hooks)</w:t>
+      </w:r>
+    </w:p>
+    <w:p>
+      <w:pPr>
+        <w:tabs>
+          <w:tab w:val="right" w:pos="10346"/>
+        </w:tabs>
+        <w:spacing w:after="0" w:before="110"/>
+      </w:pPr>
+      <w:r>
+        <w:rPr>
+          <w:b/>
+          <w:bCs/>
+          <w:sz w:val="21"/>
+          <w:szCs w:val="21"/>
+        </w:rPr>
         <w:t xml:space="preserve">Dispatch Team Member — Amart Furniture</w:t>
       </w:r>
       <w:r>
@@ -619,7 +736,7 @@
           <w:sz w:val="19"/>
           <w:szCs w:val="19"/>
         </w:rPr>
-        <w:t xml:space="preserve">Melbourne, VIC  ·  Coursework: Intelligent Decision Making (ASP/Clingo), Computer Vision, Machine Learning, AI Systems Design, Internet of Things (IoT)</w:t>
+        <w:t xml:space="preserve">Melbourne, VIC  ·  Intelligent Decision Making (ASP/Clingo), Computer Vision, Machine Learning, AI Systems Design, IoT</w:t>
       </w:r>
     </w:p>
     <w:p>
@@ -905,7 +1022,7 @@
         </w:rPr>
         <w:t xml:space="preserve">GitHub: </w:t>
       </w:r>
-      <w:hyperlink w:history="1" r:id="rId_layyzsquoldrgfxodllb">
+      <w:hyperlink w:history="1" r:id="rIdjme2i_lras6gkca8p9jen">
         <w:r>
           <w:rPr>
             <w:color w:val="1F3A5F"/>
@@ -1010,7 +1127,7 @@
         </w:rPr>
         <w:t xml:space="preserve">GitHub: </w:t>
       </w:r>
-      <w:hyperlink w:history="1" r:id="rIdjlpfot4xtqdyuklm-lpyd">
+      <w:hyperlink w:history="1" r:id="rId4cjb_l8yjz0tm1huordg9">
         <w:r>
           <w:rPr>
             <w:color w:val="1F3A5F"/>
@@ -1069,7 +1186,7 @@
         </w:rPr>
         <w:t xml:space="preserve">Live: </w:t>
       </w:r>
-      <w:hyperlink w:history="1" r:id="rIdbedjxyo5mvbqjgeouahrj">
+      <w:hyperlink w:history="1" r:id="rIdqzrhx6p_mogohtxvw3l6t">
         <w:r>
           <w:rPr>
             <w:color w:val="1F3A5F"/>
@@ -1158,7 +1275,7 @@
         </w:rPr>
         <w:t xml:space="preserve"> authored five reusable skills — CO-STAR requirements builder, Socratic tutor, better-way reviewer, skill sync, and a pikepdf CLI that unlocks signature-locked PDFs.  </w:t>
       </w:r>
-      <w:hyperlink w:history="1" r:id="rId4pspvhogqcfh3gdgdtkcd">
+      <w:hyperlink w:history="1" r:id="rIdkiwk5mkvjv9lw3a3ldhxj">
         <w:r>
           <w:rPr>
             <w:color w:val="1F3A5F"/>
@@ -1258,7 +1375,7 @@
         </w:rPr>
         <w:t xml:space="preserve">, Vol. 9(12), pp. 43–51, Dec 2023 (ISSN 2321-3795, peer-reviewed). Benchmarked 5 edge-detection operators × 8 classifiers (40 combinations) as a lesion feature-extraction step on a 15,000-image, four-class maize dataset; best result Sobel + MLP at 94.75%. Implemented the Canny arm (OpenCV + scikit-learn, ten classifiers).  ↳ </w:t>
       </w:r>
-      <w:hyperlink w:history="1" r:id="rIdqfzpjjjsgwnxm0-epyop2">
+      <w:hyperlink w:history="1" r:id="rIdyznuyhn8gh9es2ndx-gof">
         <w:r>
           <w:rPr>
             <w:color w:val="1F3A5F"/>
@@ -1276,7 +1393,7 @@
         </w:rPr>
         <w:t xml:space="preserve">   ·   Code: </w:t>
       </w:r>
-      <w:hyperlink w:history="1" r:id="rIdq_24ybr6xdqh4pxaeabi5">
+      <w:hyperlink w:history="1" r:id="rIdvs9ro1-omtd2l2bds2x23">
         <w:r>
           <w:rPr>
             <w:color w:val="1F3A5F"/>

</xml_diff>

<commit_message>
IBM Z badges: write-up with credential IDs, and link them on the resume
- Source/IBM_Z/README.md: both Credly badges (Concepts, May 2026;
  Community Contributor Level 1, Aug 2026) with credential IDs and
  verify links, plus the live z/OS development environment.
- base_resume: certification line names both badges with dates and
  links to Credly; re-rendered (2 pages).
- The badges and toolchain come off the "unverified template items"
  list in Faraaz_Mohammed_Resume_Base.md; Source index updated.

Co-Authored-By: Claude Opus 5.5 <noreply@anthropic.com>
Claude-Session: https://claude.ai/code/session_018K48sPd6fZ6f4RxmdVC7MK
</commit_message>
<xml_diff>
--- a/Faraaz_Mohammed_Resume_Base.docx
+++ b/Faraaz_Mohammed_Resume_Base.docx
@@ -37,7 +37,7 @@
         <w:spacing w:after="20"/>
         <w:jc w:val="center"/>
       </w:pPr>
-      <w:hyperlink w:history="1" r:id="rIdyj9gzcvq-xhl__fnzu0ea">
+      <w:hyperlink w:history="1" r:id="rIdmjzukn9xuy1-jxhpmsuux">
         <w:r>
           <w:rPr>
             <w:color w:val="1F3A5F"/>
@@ -56,7 +56,7 @@
         </w:rPr>
         <w:t xml:space="preserve">  •  </w:t>
       </w:r>
-      <w:hyperlink w:history="1" r:id="rIdacblhwl8egbzlpyxrpnch">
+      <w:hyperlink w:history="1" r:id="rIdsozsrw-czjhrewxqsjz3p">
         <w:r>
           <w:rPr>
             <w:color w:val="1F3A5F"/>
@@ -75,7 +75,7 @@
         </w:rPr>
         <w:t xml:space="preserve">  •  </w:t>
       </w:r>
-      <w:hyperlink w:history="1" r:id="rIdbqwf5j0-qvhzmkda0z2y6">
+      <w:hyperlink w:history="1" r:id="rIdrukp4-q0dxbfsee5metmm">
         <w:r>
           <w:rPr>
             <w:color w:val="1F3A5F"/>
@@ -1022,7 +1022,7 @@
         </w:rPr>
         <w:t xml:space="preserve">GitHub: </w:t>
       </w:r>
-      <w:hyperlink w:history="1" r:id="rIdjme2i_lras6gkca8p9jen">
+      <w:hyperlink w:history="1" r:id="rId3edo_fixmyomuie5fblon">
         <w:r>
           <w:rPr>
             <w:color w:val="1F3A5F"/>
@@ -1127,7 +1127,7 @@
         </w:rPr>
         <w:t xml:space="preserve">GitHub: </w:t>
       </w:r>
-      <w:hyperlink w:history="1" r:id="rId4cjb_l8yjz0tm1huordg9">
+      <w:hyperlink w:history="1" r:id="rIdxdo5elbhimdroxfxz-usa">
         <w:r>
           <w:rPr>
             <w:color w:val="1F3A5F"/>
@@ -1186,7 +1186,7 @@
         </w:rPr>
         <w:t xml:space="preserve">Live: </w:t>
       </w:r>
-      <w:hyperlink w:history="1" r:id="rIdqzrhx6p_mogohtxvw3l6t">
+      <w:hyperlink w:history="1" r:id="rIdvsm3ttogmrngvapuyszvn">
         <w:r>
           <w:rPr>
             <w:color w:val="1F3A5F"/>
@@ -1275,7 +1275,7 @@
         </w:rPr>
         <w:t xml:space="preserve"> authored five reusable skills — CO-STAR requirements builder, Socratic tutor, better-way reviewer, skill sync, and a pikepdf CLI that unlocks signature-locked PDFs.  </w:t>
       </w:r>
-      <w:hyperlink w:history="1" r:id="rIdkiwk5mkvjv9lw3a3ldhxj">
+      <w:hyperlink w:history="1" r:id="rIdkjea4v0hsc-jp0apzx75s">
         <w:r>
           <w:rPr>
             <w:color w:val="1F3A5F"/>
@@ -1375,7 +1375,7 @@
         </w:rPr>
         <w:t xml:space="preserve">, Vol. 9(12), pp. 43–51, Dec 2023 (ISSN 2321-3795, peer-reviewed). Benchmarked 5 edge-detection operators × 8 classifiers (40 combinations) as a lesion feature-extraction step on a 15,000-image, four-class maize dataset; best result Sobel + MLP at 94.75%. Implemented the Canny arm (OpenCV + scikit-learn, ten classifiers).  ↳ </w:t>
       </w:r>
-      <w:hyperlink w:history="1" r:id="rIdyznuyhn8gh9es2ndx-gof">
+      <w:hyperlink w:history="1" r:id="rIdteyctipgc-ywhctpwrfwj">
         <w:r>
           <w:rPr>
             <w:color w:val="1F3A5F"/>
@@ -1393,7 +1393,7 @@
         </w:rPr>
         <w:t xml:space="preserve">   ·   Code: </w:t>
       </w:r>
-      <w:hyperlink w:history="1" r:id="rIdvs9ro1-omtd2l2bds2x23">
+      <w:hyperlink w:history="1" r:id="rIdpkcx9jxdqonesjd_5ggx1">
         <w:r>
           <w:rPr>
             <w:color w:val="1F3A5F"/>
@@ -1438,7 +1438,43 @@
           <w:sz w:val="20"/>
           <w:szCs w:val="20"/>
         </w:rPr>
-        <w:t xml:space="preserve">IBM Z Xplore – Concepts and IBM Z &amp; LinuxONE Community Contributor – Level 1 (IBM digital badges via Credly, 2026).</w:t>
+        <w:t xml:space="preserve">IBM badges on Credly: </w:t>
+      </w:r>
+      <w:hyperlink w:history="1" r:id="rIdnh6ymsj7cc2nggyhrqcmz">
+        <w:r>
+          <w:rPr>
+            <w:color w:val="1F3A5F"/>
+            <w:sz w:val="18"/>
+            <w:szCs w:val="18"/>
+            <w:u w:val="single"/>
+          </w:rPr>
+          <w:t xml:space="preserve">IBM Z Xplore – Concepts</w:t>
+        </w:r>
+      </w:hyperlink>
+      <w:r>
+        <w:rPr>
+          <w:sz w:val="20"/>
+          <w:szCs w:val="20"/>
+        </w:rPr>
+        <w:t xml:space="preserve"> (May 2026)  ·  </w:t>
+      </w:r>
+      <w:hyperlink w:history="1" r:id="rIdyacs3aujbnutmiwcah-tn">
+        <w:r>
+          <w:rPr>
+            <w:color w:val="1F3A5F"/>
+            <w:sz w:val="18"/>
+            <w:szCs w:val="18"/>
+            <w:u w:val="single"/>
+          </w:rPr>
+          <w:t xml:space="preserve">IBM Z &amp; LinuxONE Community Contributor – Level 1</w:t>
+        </w:r>
+      </w:hyperlink>
+      <w:r>
+        <w:rPr>
+          <w:sz w:val="20"/>
+          <w:szCs w:val="20"/>
+        </w:rPr>
+        <w:t xml:space="preserve"> (Aug 2026).</w:t>
       </w:r>
     </w:p>
     <w:p>

</xml_diff>

<commit_message>
Catch up with 22 Oct GitHub work: Vayaa on Python + AWS, Time Flow on iOS
- Source/Vayaa: rebuilt from the dev branch — Rust first, then the
  Python (FastAPI) port behind 50 parity tests, PostgreSQL, Docker
  Compose, five deploy attempts to live on AWS (CloudFormation:
  CloudFront → ALB → Fargate → RDS), SNS alerts. No public URL (the
  service is parked when not needed); no account or case IDs.
- Source/Time_Flow: iOS shell on the apple branch (in progress).
- base_resume: Vayaa entry rewritten (Rust → Python port, AWS deploy);
  Docker and AWS in tooling, FastAPI/PostgreSQL in software; Time Flow
  notes the iOS shell. Re-rendered, 2 pages, no layout defects.
- GitHub audit and Source index updated (Vaya → Vayaa rename).

Co-Authored-By: Claude Opus 5.5 <noreply@anthropic.com>
Claude-Session: https://claude.ai/code/session_018K48sPd6fZ6f4RxmdVC7MK
</commit_message>
<xml_diff>
--- a/Faraaz_Mohammed_Resume_Base.docx
+++ b/Faraaz_Mohammed_Resume_Base.docx
@@ -37,7 +37,7 @@
         <w:spacing w:after="20"/>
         <w:jc w:val="center"/>
       </w:pPr>
-      <w:hyperlink w:history="1" r:id="rIdmjzukn9xuy1-jxhpmsuux">
+      <w:hyperlink w:history="1" r:id="rIdan0s3dxcoyaeonhy_aonk">
         <w:r>
           <w:rPr>
             <w:color w:val="1F3A5F"/>
@@ -56,7 +56,7 @@
         </w:rPr>
         <w:t xml:space="preserve">  •  </w:t>
       </w:r>
-      <w:hyperlink w:history="1" r:id="rIdsozsrw-czjhrewxqsjz3p">
+      <w:hyperlink w:history="1" r:id="rId1ec0nvbmunwfjzn9vrx9a">
         <w:r>
           <w:rPr>
             <w:color w:val="1F3A5F"/>
@@ -75,7 +75,7 @@
         </w:rPr>
         <w:t xml:space="preserve">  •  </w:t>
       </w:r>
-      <w:hyperlink w:history="1" r:id="rIdrukp4-q0dxbfsee5metmm">
+      <w:hyperlink w:history="1" r:id="rIdfgojsokba0qzfgjv6l_tm">
         <w:r>
           <w:rPr>
             <w:color w:val="1F3A5F"/>
@@ -131,7 +131,7 @@
           <w:sz w:val="20"/>
           <w:szCs w:val="20"/>
         </w:rPr>
-        <w:t xml:space="preserve">Master of Artificial Intelligence graduate (RMIT, 2026) with a B.Tech in IT; full-stack developer intern at Vayaa after an AI/ML engineering internship delivering geospatial ML pipelines at national scale. Co-author of a peer-reviewed computer-vision paper. Works end to end — requirements, code, tests, review — across Python ML, Rust, Android and web; built two Android apps and an MCP-based LLM tool in 2026. Seeking graduate AI/ML or software engineering roles across Australia.</w:t>
+        <w:t xml:space="preserve">Master of Artificial Intelligence graduate (RMIT, 2026) with a B.Tech in IT; full-stack developer intern at Vayaa after an AI/ML engineering internship delivering geospatial ML pipelines at national scale. Co-author of a peer-reviewed computer-vision paper. Works end to end — requirements, code, tests, review — across Python, Rust, Android, web and AWS; built two Android apps and an MCP-based LLM tool in 2026. Seeking graduate AI/ML or software engineering roles across Australia.</w:t>
       </w:r>
     </w:p>
     <w:p>
@@ -234,7 +234,7 @@
           <w:sz w:val="20"/>
           <w:szCs w:val="20"/>
         </w:rPr>
-        <w:t xml:space="preserve">Android (Kotlin, AlarmManager, BroadcastReceiver, notification channels, Gradle KTS, JUnit), Rust web APIs (Axum, Tokio, serde), React, PWA (service workers), Node.js, Next.js, Prisma, REST/JSON</w:t>
+        <w:t xml:space="preserve">Android (Kotlin, AlarmManager, BroadcastReceiver, notification channels, Gradle KTS, JUnit), web APIs (FastAPI, Rust/Axum), PostgreSQL (SQLAlchemy), React, PWA, Node.js, Next.js, Prisma, REST/JSON</w:t>
       </w:r>
     </w:p>
     <w:p>
@@ -276,7 +276,7 @@
           <w:sz w:val="20"/>
           <w:szCs w:val="20"/>
         </w:rPr>
-        <w:t xml:space="preserve">Git / GitHub, Kestra, Docker (basic), Colab / Jupyter, Vercel, GitHub Pages, IBM z/OS + Zowe, Linux</w:t>
+        <w:t xml:space="preserve">Git / GitHub, Docker, AWS (CloudFormation, Fargate, RDS, CloudFront, SNS), Kestra, Colab, Vercel, Linux</w:t>
       </w:r>
     </w:p>
     <w:p>
@@ -338,7 +338,7 @@
           <w:sz w:val="19"/>
           <w:szCs w:val="19"/>
         </w:rPr>
-        <w:t xml:space="preserve">Melbourne, VIC  ·  hybrid  ·  company website: React + TypeScript frontend, Rust (Axum) backend, Docker then AWS</w:t>
+        <w:t xml:space="preserve">Melbourne, VIC  ·  hybrid  ·  company website: React + TypeScript, Python (FastAPI) + PostgreSQL, deployed on AWS</w:t>
       </w:r>
     </w:p>
     <w:p>
@@ -372,24 +372,24 @@
           <w:sz w:val="20"/>
           <w:szCs w:val="20"/>
         </w:rPr>
-        <w:t xml:space="preserve">Built the Rust backend's contact-enquiry API: server-side validation that reports every failed rule at once and converts raw input into a clean type, so only checked data can reach the database.</w:t>
-      </w:r>
-    </w:p>
-    <w:p>
-      <w:pPr>
-        <w:pStyle w:val="ListParagraph"/>
-        <w:numPr>
-          <w:ilvl w:val="0"/>
-          <w:numId w:val="2"/>
-        </w:numPr>
-        <w:spacing w:after="24"/>
-      </w:pPr>
-      <w:r>
-        <w:rPr>
-          <w:sz w:val="20"/>
-          <w:szCs w:val="20"/>
-        </w:rPr>
-        <w:t xml:space="preserve">Capped request bodies at 16 KB so oversized payloads are refused before parsing, limited CORS to the frontend's origin, and verified the 200 / 400 / 413 / 422 paths with curl.</w:t>
+        <w:t xml:space="preserve">Built the contact-enquiry API in Rust (server-side validation, clean types), then led its port to Python (FastAPI) on the mentor's call, gating the cutover on 50 parity tests passing against both backends.</w:t>
+      </w:r>
+    </w:p>
+    <w:p>
+      <w:pPr>
+        <w:pStyle w:val="ListParagraph"/>
+        <w:numPr>
+          <w:ilvl w:val="0"/>
+          <w:numId w:val="2"/>
+        </w:numPr>
+        <w:spacing w:after="24"/>
+      </w:pPr>
+      <w:r>
+        <w:rPr>
+          <w:sz w:val="20"/>
+          <w:szCs w:val="20"/>
+        </w:rPr>
+        <w:t xml:space="preserve">Took it live on AWS with CloudFormation (CloudFront → ECS Fargate → RDS PostgreSQL) in five attempts, fixing Free-plan limits, a CloudFront account block and RDS TLS (verify-full); SNS emails each enquiry.</w:t>
       </w:r>
     </w:p>
     <w:p>
@@ -412,7 +412,7 @@
           <w:sz w:val="19"/>
           <w:szCs w:val="19"/>
         </w:rPr>
-        <w:t xml:space="preserve"> Rust, Axum, Tokio, serde, React 19, TypeScript, Vite, Git, Claude Code</w:t>
+        <w:t xml:space="preserve"> Python, FastAPI, SQLAlchemy, PostgreSQL, Docker, AWS, Rust (Axum), React, TypeScript, Claude Code</w:t>
       </w:r>
     </w:p>
     <w:p>
@@ -870,7 +870,7 @@
           <w:sz w:val="20"/>
           <w:szCs w:val="20"/>
         </w:rPr>
-        <w:t xml:space="preserve">Vanilla-JS UI in a Kotlin WebView shell that owns exact alarms, reboot recovery and a foreground service keeping focus timers alive; started as an offline-first PWA.</w:t>
+        <w:t xml:space="preserve">Vanilla-JS UI in a Kotlin WebView shell that owns exact alarms, reboot recovery and a foreground service keeping focus timers alive; iOS (Swift) shell in progress.</w:t>
       </w:r>
     </w:p>
     <w:p>
@@ -1022,7 +1022,7 @@
         </w:rPr>
         <w:t xml:space="preserve">GitHub: </w:t>
       </w:r>
-      <w:hyperlink w:history="1" r:id="rId3edo_fixmyomuie5fblon">
+      <w:hyperlink w:history="1" r:id="rIdnr08ii9dw0ben2scxzet-">
         <w:r>
           <w:rPr>
             <w:color w:val="1F3A5F"/>
@@ -1127,7 +1127,7 @@
         </w:rPr>
         <w:t xml:space="preserve">GitHub: </w:t>
       </w:r>
-      <w:hyperlink w:history="1" r:id="rIdxdo5elbhimdroxfxz-usa">
+      <w:hyperlink w:history="1" r:id="rIdmdp1t8fn4q15-bdawwyuj">
         <w:r>
           <w:rPr>
             <w:color w:val="1F3A5F"/>
@@ -1186,7 +1186,7 @@
         </w:rPr>
         <w:t xml:space="preserve">Live: </w:t>
       </w:r>
-      <w:hyperlink w:history="1" r:id="rIdvsm3ttogmrngvapuyszvn">
+      <w:hyperlink w:history="1" r:id="rIdjmhpywtajgjid_ngsrh-q">
         <w:r>
           <w:rPr>
             <w:color w:val="1F3A5F"/>
@@ -1275,7 +1275,7 @@
         </w:rPr>
         <w:t xml:space="preserve"> authored five reusable skills — CO-STAR requirements builder, Socratic tutor, better-way reviewer, skill sync, and a pikepdf CLI that unlocks signature-locked PDFs.  </w:t>
       </w:r>
-      <w:hyperlink w:history="1" r:id="rIdkjea4v0hsc-jp0apzx75s">
+      <w:hyperlink w:history="1" r:id="rId9lb5x9hker2fpha7wwku7">
         <w:r>
           <w:rPr>
             <w:color w:val="1F3A5F"/>
@@ -1375,7 +1375,7 @@
         </w:rPr>
         <w:t xml:space="preserve">, Vol. 9(12), pp. 43–51, Dec 2023 (ISSN 2321-3795, peer-reviewed). Benchmarked 5 edge-detection operators × 8 classifiers (40 combinations) as a lesion feature-extraction step on a 15,000-image, four-class maize dataset; best result Sobel + MLP at 94.75%. Implemented the Canny arm (OpenCV + scikit-learn, ten classifiers).  ↳ </w:t>
       </w:r>
-      <w:hyperlink w:history="1" r:id="rIdteyctipgc-ywhctpwrfwj">
+      <w:hyperlink w:history="1" r:id="rIdvp6erishtf_8t2ivwk90v">
         <w:r>
           <w:rPr>
             <w:color w:val="1F3A5F"/>
@@ -1393,7 +1393,7 @@
         </w:rPr>
         <w:t xml:space="preserve">   ·   Code: </w:t>
       </w:r>
-      <w:hyperlink w:history="1" r:id="rIdpkcx9jxdqonesjd_5ggx1">
+      <w:hyperlink w:history="1" r:id="rIdotywtj35bmkkv0lrpnqqx">
         <w:r>
           <w:rPr>
             <w:color w:val="1F3A5F"/>
@@ -1440,7 +1440,7 @@
         </w:rPr>
         <w:t xml:space="preserve">IBM badges on Credly: </w:t>
       </w:r>
-      <w:hyperlink w:history="1" r:id="rIdnh6ymsj7cc2nggyhrqcmz">
+      <w:hyperlink w:history="1" r:id="rIdkrrda89r_xblmo22gccsb">
         <w:r>
           <w:rPr>
             <w:color w:val="1F3A5F"/>
@@ -1458,7 +1458,7 @@
         </w:rPr>
         <w:t xml:space="preserve"> (May 2026)  ·  </w:t>
       </w:r>
-      <w:hyperlink w:history="1" r:id="rIdyacs3aujbnutmiwcah-tn">
+      <w:hyperlink w:history="1" r:id="rIdlaqb8ulc_93pdp0575mpl">
         <w:r>
           <w:rPr>
             <w:color w:val="1F3A5F"/>

</xml_diff>